<commit_message>
docs: refresh feature documentation and exports
</commit_message>
<xml_diff>
--- a/docs/exports/docx/Documentation-Hub.docx
+++ b/docs/exports/docx/Documentation-Hub.docx
@@ -4,7 +4,7 @@
   <w:body>
     <w:p>
       <w:r>
-        <w:t>Documentation-Hub :root { color-scheme: light; } body { font-family: "Segoe UI", "Helvetica Neue", Arial, sans-serif; margin: 0; padding: 0; background: #ffffff; color: #0f172a; } .markdown-body { max-width: 980px; margin: 40px auto 60px; padding: 0 32px; line-height: 1.65; } .markdown-body h1 { font-size: 32px; margin-bottom: 12px; border-bottom: 2px solid #e2e8f0; padding-bottom: 12px; page-break-before: always; page-break-after: avoid; break-before: page; break-after: avoid; } .markdown-body h1:first-of-type { page-break-before: avoid; break-before: avoid; } .markdown-body h2 { font-size: 24px; margin-top: 28px; border-bottom: 1px solid #e2e8f0; padding-bottom: 8px; page-break-before: always; page-break-after: avoid; break-before: page; break-after: avoid; } .markdown-body h3 { font-size: 18px; margin-top: 20px; page-break-after: avoid; break-after: avoid; } .markdown-body h4, .markdown-body h5, .markdown-body h6 { page-break-after: avoid; break-after: avoid; } .markdown-body table { width: 100%; border-collapse: collapse; margin: 16px 0; font-size: 14px; page-break-inside: avoid; break-inside: avoid; } .markdown-body th, .markdown-body td { border: 1px solid #e2e8f0; padding: 8px 10px; text-align: left; } .markdown-body th { background: #f8fafc; } .markdown-body tr { page-break-inside: avoid; break-inside: avoid; } .markdown-body code { background: #f1f5f9; padding: 2px 4px; border-radius: 4px; font-family: "SFMono-Regular", Menlo, Consolas, monospace; font-size: 0.92em; } .markdown-body pre { background: #0f172a; color: #e2e8f0; padding: 16px; border-radius: 8px; overflow-x: auto; page-break-inside: avoid; break-inside: avoid; } .markdown-body pre code { background: transparent; color: inherit; } .markdown-body blockquote { border-left: 4px solid #38bdf8; margin: 16px 0; padding: 8px 16px; background: #f8fafc; color: #334155; } .markdown-body img { max-width: 100%; height: auto; display: block; margin: 16px 0; border-radius: 10px; box-shadow: 0 8px 20px rgba(15, 23, 42, 0.12); page-break-inside: avoid; break-inside: avoid; } .markdown-body figure { page-break-inside: avoid; break-inside: avoid; margin: 16px 0; } .markdown-body a { color: #2563eb; text-decoration: none; } .markdown-body a:hover { text-decoration: underline; } .cover { padding: 80px 60px 60px; background: linear-gradient(135deg, #0b1220 0%, #1e3a8a 100%); color: #f8fafc; border-radius: 18px; margin-bottom: 32px; } .cover-title { font-size: 36px; font-weight: 700; margin: 0 0 12px; } .cover-subtitle { font-size: 18px; color: #cbd5f5; margin: 0 0 16px; } .cover-meta { font-size: 13px; color: #94a3b8; } .page-break { page-break-after: always; break-after: page; } .footer { margin-top: 40px; font-size: 12px; color: #64748b; } /* Print and PDF-specific styles */ @page { margin: 20mm 18mm; } @media print { .markdown-body { orphans: 3; widows: 3; } .markdown-body p { orphans: 3; widows: 3; } .markdown-body li { page-break-inside: avoid; break-inside: avoid; } .markdown-body ul, .markdown-body ol { page-break-before: avoid; break-before: avoid; } .markdown-body blockquote { page-break-inside: avoid; break-inside: avoid; } /* Keep section content together */ .markdown-body h2 + *, .markdown-body h3 + * { page-break-before: avoid; break-before: avoid; } } Documentation Hub</w:t>
+        <w:t>Documentation-Hub :root { color-scheme: light; } body { font-family: "Segoe UI", "Helvetica Neue", Arial, sans-serif; margin: 0; padding: 0; background: #f4f7fb; color: #0f172a; } .markdown-body { max-width: 980px; margin: 0 auto; padding: 36px 42px 64px; line-height: 1.65; background: #ffffff; box-shadow: 0 24px 70px rgba(15, 23, 42, 0.08); } .markdown-body h1 { font-size: 34px; line-height: 1.12; margin-bottom: 12px; color: #07111f; border-bottom: 3px solid #0ea5e9; padding-bottom: 12px; page-break-before: always; page-break-after: avoid; break-before: page; break-after: avoid; } .markdown-body h1:first-of-type { page-break-before: avoid; break-before: avoid; } .markdown-body h2 { font-size: 23px; line-height: 1.2; margin-top: 34px; color: #102a43; border-bottom: 1px solid #d7e2ee; padding-bottom: 8px; page-break-after: avoid; break-after: avoid; } .markdown-body h3 { font-size: 18px; margin-top: 20px; color: #1e3a5f; page-break-after: avoid; break-after: avoid; } .markdown-body h4, .markdown-body h5, .markdown-body h6 { page-break-after: avoid; break-after: avoid; } .markdown-body table { width: 100%; border-collapse: collapse; margin: 18px 0 24px; font-size: 13px; page-break-inside: avoid; break-inside: avoid; box-shadow: 0 1px 0 #e2e8f0; } .markdown-body th, .markdown-body td { border: 1px solid #e2e8f0; padding: 9px 11px; text-align: left; vertical-align: top; } .markdown-body th { background: #eef6ff; color: #0f3157; font-weight: 700; } .markdown-body tr:nth-child(even) td { background: #fbfdff; } .markdown-body tr { page-break-inside: avoid; break-inside: avoid; } .markdown-body code { background: #f1f5f9; padding: 2px 4px; border-radius: 4px; font-family: "SFMono-Regular", Menlo, Consolas, monospace; font-size: 0.92em; } .markdown-body pre { background: #111827; color: #e5eef8; padding: 16px; border-radius: 10px; overflow-x: auto; border: 1px solid #243244; page-break-inside: avoid; break-inside: avoid; } .markdown-body pre code { background: transparent; color: inherit; } .markdown-body blockquote { border-left: 5px solid #0ea5e9; margin: 18px 0; padding: 12px 18px; background: #eff8ff; color: #18324f; border-radius: 0 10px 10px 0; } .markdown-body img { max-width: 100%; height: auto; display: block; margin: 16px 0; border-radius: 10px; box-shadow: 0 8px 20px rgba(15, 23, 42, 0.12); page-break-inside: avoid; break-inside: avoid; } .markdown-body figure { page-break-inside: avoid; break-inside: avoid; margin: 16px 0; } .markdown-body a { color: #2563eb; text-decoration: none; } .markdown-body a:hover { text-decoration: underline; } .cover { min-height: 760px; display: flex; flex-direction: column; justify-content: flex-end; padding: 72px 60px 64px; background: linear-gradient(135deg, rgba(9, 30, 66, 0.96) 0%, rgba(12, 74, 110, 0.94) 54%, rgba(20, 83, 45, 0.9) 100%), radial-gradient(circle at 18% 18%, rgba(14, 165, 233, 0.25), transparent 36%); color: #f8fafc; border-radius: 0; margin: -36px -42px 40px; position: relative; overflow: hidden; } .cover::before { content: "PSScript"; position: absolute; top: 46px; left: 60px; font-size: 12px; font-weight: 800; letter-spacing: 0.24em; text-transform: uppercase; color: rgba(226, 246, 255, 0.82); } .cover::after { content: ""; position: absolute; right: -120px; top: -120px; width: 360px; height: 360px; border: 1px solid rgba(255, 255, 255, 0.18); transform: rotate(28deg); } .markdown-body .cover-title { font-size: 48px; line-height: 1.04; font-weight: 800; color: #f8fafc; border-bottom: 3px solid #38bdf8; margin: 0 0 16px; max-width: 720px; } .cover-subtitle { font-size: 20px; line-height: 1.42; color: #dbeafe; margin: 0 0 22px; max-width: 720px; } .cover-meta { display: inline-block; width: fit-content; font-size: 13px; color: #e0f2fe; background: rgba(255, 255, 255, 0.12); border: 1px solid rgba(255, 255, 255, 0.18); border-radius: 999px; padding: 7px 13px; } .page-break { page-break-after: always; break-after: page; } .footer { margin-top: 40px; font-size: 12px; color: #64748b; border-top: 1px solid #e2e8f0; padding-top: 14px; } /* Print and PDF-specific styles */ @page { size: A4; margin: 18mm 16mm 20mm; } @media print { body { background: #ffffff; } .markdown-body { max-width: none; margin: 0; padding: 0; box-shadow: none; } .cover { margin: 0 0 28px; } .markdown-body { orphans: 3; widows: 3; } .markdown-body p { orphans: 3; widows: 3; } .markdown-body li { page-break-inside: avoid; break-inside: avoid; } .markdown-body ul, .markdown-body ol { page-break-before: avoid; break-before: avoid; } .markdown-body blockquote { page-break-inside: avoid; break-inside: avoid; } /* Keep section content together */ .markdown-body h2 + *, .markdown-body h3 + * { page-break-before: avoid; break-before: avoid; } } Documentation Hub</w:t>
       </w:r>
     </w:p>
     <w:p>
@@ -32,43 +32,12 @@
     </w:p>
     <w:p>
       <w:r>
-        <w:drawing>
-          <wp:inline xmlns:a="http://schemas.openxmlformats.org/drawingml/2006/main" xmlns:pic="http://schemas.openxmlformats.org/drawingml/2006/picture">
-            <wp:extent cx="5303520" cy="5303520"/>
-            <wp:docPr id="1" name="Picture 1"/>
-            <wp:cNvGraphicFramePr>
-              <a:graphicFrameLocks noChangeAspect="1"/>
-            </wp:cNvGraphicFramePr>
-            <a:graphic>
-              <a:graphicData uri="http://schemas.openxmlformats.org/drawingml/2006/picture">
-                <pic:pic>
-                  <pic:nvPicPr>
-                    <pic:cNvPr id="0" name="image.png"/>
-                    <pic:cNvPicPr/>
-                  </pic:nvPicPr>
-                  <pic:blipFill>
-                    <a:blip r:embed="rId9"/>
-                    <a:stretch>
-                      <a:fillRect/>
-                    </a:stretch>
-                  </pic:blipFill>
-                  <pic:spPr>
-                    <a:xfrm>
-                      <a:off x="0" y="0"/>
-                      <a:ext cx="5303520" cy="5303520"/>
-                    </a:xfrm>
-                    <a:prstGeom prst="rect"/>
-                  </pic:spPr>
-                </pic:pic>
-              </a:graphicData>
-            </a:graphic>
-          </wp:inline>
-        </w:drawing>
+        <w:t>Last updated: April 29, 2026.</w:t>
       </w:r>
     </w:p>
     <w:p>
       <w:r>
-        <w:t>Welcome to the documentation hub for PSScript Manager. Use this page to navigate onboarding, deployment, and feature documentation.</w:t>
+        <w:t>This index points to active documentation for the current Netlify + hosted Supabase production state. Archive folders are historical and preserved, but they are not the current runbook.</w:t>
       </w:r>
     </w:p>
     <w:p>
@@ -76,143 +45,7 @@
         <w:pStyle w:val="Heading2"/>
       </w:pPr>
       <w:r>
-        <w:t>Quick links</w:t>
-      </w:r>
-    </w:p>
-    <w:p>
-      <w:pPr>
-        <w:pStyle w:val="ListBullet"/>
-      </w:pPr>
-      <w:r>
-        <w:t xml:space="preserve">Getting started: </w:t>
-      </w:r>
-      <w:r>
-        <w:rPr>
-          <w:rFonts w:ascii="Mono" w:hAnsi="Mono"/>
-        </w:rPr>
-        <w:t>GETTING-STARTED.md</w:t>
-      </w:r>
-    </w:p>
-    <w:p>
-      <w:pPr>
-        <w:pStyle w:val="ListBullet"/>
-      </w:pPr>
-      <w:r>
-        <w:t xml:space="preserve">Docker setup: </w:t>
-      </w:r>
-      <w:r>
-        <w:rPr>
-          <w:rFonts w:ascii="Mono" w:hAnsi="Mono"/>
-        </w:rPr>
-        <w:t>../DOCKER-QUICKSTART.md</w:t>
-      </w:r>
-    </w:p>
-    <w:p>
-      <w:pPr>
-        <w:pStyle w:val="ListBullet"/>
-      </w:pPr>
-      <w:r>
-        <w:t xml:space="preserve">Management playbook: </w:t>
-      </w:r>
-      <w:r>
-        <w:rPr>
-          <w:rFonts w:ascii="Mono" w:hAnsi="Mono"/>
-        </w:rPr>
-        <w:t>MANAGEMENT-PLAYBOOK.md</w:t>
-      </w:r>
-    </w:p>
-    <w:p>
-      <w:pPr>
-        <w:pStyle w:val="ListBullet"/>
-      </w:pPr>
-      <w:r>
-        <w:t xml:space="preserve">Training suite: </w:t>
-      </w:r>
-      <w:r>
-        <w:rPr>
-          <w:rFonts w:ascii="Mono" w:hAnsi="Mono"/>
-        </w:rPr>
-        <w:t>training-suite/README.md</w:t>
-      </w:r>
-    </w:p>
-    <w:p>
-      <w:pPr>
-        <w:pStyle w:val="ListBullet"/>
-      </w:pPr>
-      <w:r>
-        <w:t xml:space="preserve">Training guide: </w:t>
-      </w:r>
-      <w:r>
-        <w:rPr>
-          <w:rFonts w:ascii="Mono" w:hAnsi="Mono"/>
-        </w:rPr>
-        <w:t>training-suite/TRAINING-GUIDE.md</w:t>
-      </w:r>
-    </w:p>
-    <w:p>
-      <w:pPr>
-        <w:pStyle w:val="ListBullet"/>
-      </w:pPr>
-      <w:r>
-        <w:t xml:space="preserve">Support: </w:t>
-      </w:r>
-      <w:r>
-        <w:rPr>
-          <w:rFonts w:ascii="Mono" w:hAnsi="Mono"/>
-        </w:rPr>
-        <w:t>SUPPORT.md</w:t>
-      </w:r>
-    </w:p>
-    <w:p>
-      <w:pPr>
-        <w:pStyle w:val="Heading2"/>
-      </w:pPr>
-      <w:r>
-        <w:t>Platform overview</w:t>
-      </w:r>
-    </w:p>
-    <w:p>
-      <w:r>
-        <w:drawing>
-          <wp:inline xmlns:a="http://schemas.openxmlformats.org/drawingml/2006/main" xmlns:pic="http://schemas.openxmlformats.org/drawingml/2006/picture">
-            <wp:extent cx="5303520" cy="5303520"/>
-            <wp:docPr id="2" name="Picture 2"/>
-            <wp:cNvGraphicFramePr>
-              <a:graphicFrameLocks noChangeAspect="1"/>
-            </wp:cNvGraphicFramePr>
-            <a:graphic>
-              <a:graphicData uri="http://schemas.openxmlformats.org/drawingml/2006/picture">
-                <pic:pic>
-                  <pic:nvPicPr>
-                    <pic:cNvPr id="0" name="image.png"/>
-                    <pic:cNvPicPr/>
-                  </pic:nvPicPr>
-                  <pic:blipFill>
-                    <a:blip r:embed="rId9"/>
-                    <a:stretch>
-                      <a:fillRect/>
-                    </a:stretch>
-                  </pic:blipFill>
-                  <pic:spPr>
-                    <a:xfrm>
-                      <a:off x="0" y="0"/>
-                      <a:ext cx="5303520" cy="5303520"/>
-                    </a:xfrm>
-                    <a:prstGeom prst="rect"/>
-                  </pic:spPr>
-                </pic:pic>
-              </a:graphicData>
-            </a:graphic>
-          </wp:inline>
-        </w:drawing>
-      </w:r>
-    </w:p>
-    <w:p>
-      <w:pPr>
-        <w:pStyle w:val="Heading2"/>
-      </w:pPr>
-      <w:r>
-        <w:t>Documentation map</w:t>
+        <w:t>Start Here</w:t>
       </w:r>
     </w:p>
     <w:tbl>
@@ -221,9 +54,8 @@
         <w:tblLook w:firstColumn="1" w:firstRow="1" w:lastColumn="0" w:lastRow="0" w:noHBand="0" w:noVBand="1" w:val="04A0"/>
       </w:tblPr>
       <w:tblGrid>
-        <w:gridCol w:w="2880"/>
-        <w:gridCol w:w="2880"/>
-        <w:gridCol w:w="2880"/>
+        <w:gridCol w:w="4320"/>
+        <w:gridCol w:w="4320"/>
       </w:tblGrid>
       <w:tr>
         <w:tc>
@@ -232,7 +64,7 @@
           </w:tcPr>
           <w:p>
             <w:r>
-              <w:t>Area</w:t>
+              <w:t>Document</w:t>
             </w:r>
           </w:p>
         </w:tc>
@@ -242,17 +74,7 @@
           </w:tcPr>
           <w:p>
             <w:r>
-              <w:t>Description</w:t>
-            </w:r>
-          </w:p>
-        </w:tc>
-        <w:tc>
-          <w:tcPr>
-            <w:tcW w:type="dxa" w:w="0"/>
-          </w:tcPr>
-          <w:p>
-            <w:r>
-              <w:t>Link</w:t>
+              <w:t>Purpose</w:t>
             </w:r>
           </w:p>
         </w:tc>
@@ -264,7 +86,7 @@
           </w:tcPr>
           <w:p>
             <w:r>
-              <w:t>Onboarding</w:t>
+              <w:t>../README.md ../README.md</w:t>
             </w:r>
           </w:p>
         </w:tc>
@@ -274,20 +96,7 @@
           </w:tcPr>
           <w:p>
             <w:r>
-              <w:t>Setup, accounts, first run</w:t>
-            </w:r>
-          </w:p>
-        </w:tc>
-        <w:tc>
-          <w:tcPr>
-            <w:tcW w:type="dxa" w:w="0"/>
-          </w:tcPr>
-          <w:p>
-            <w:r>
-              <w:rPr>
-                <w:rFonts w:ascii="Mono" w:hAnsi="Mono"/>
-              </w:rPr>
-              <w:t>GETTING-STARTED.md</w:t>
+              <w:t>Product overview, architecture, screenshots, validation</w:t>
             </w:r>
           </w:p>
         </w:tc>
@@ -299,7 +108,7 @@
           </w:tcPr>
           <w:p>
             <w:r>
-              <w:t>Docker</w:t>
+              <w:t>CURRENT-STATUS-2026-04-24.md ./CURRENT-STATUS-2026-04-24.md</w:t>
             </w:r>
           </w:p>
         </w:tc>
@@ -309,20 +118,7 @@
           </w:tcPr>
           <w:p>
             <w:r>
-              <w:t>Infrastructure setup</w:t>
-            </w:r>
-          </w:p>
-        </w:tc>
-        <w:tc>
-          <w:tcPr>
-            <w:tcW w:type="dxa" w:w="0"/>
-          </w:tcPr>
-          <w:p>
-            <w:r>
-              <w:rPr>
-                <w:rFonts w:ascii="Mono" w:hAnsi="Mono"/>
-              </w:rPr>
-              <w:t>../DOCKER-QUICKSTART.md</w:t>
+              <w:t>Current production status, caveats, and verification</w:t>
             </w:r>
           </w:p>
         </w:tc>
@@ -334,7 +130,7 @@
           </w:tcPr>
           <w:p>
             <w:r>
-              <w:t>Vector search</w:t>
+              <w:t>GETTING-STARTED.md ./GETTING-STARTED.md</w:t>
             </w:r>
           </w:p>
         </w:tc>
@@ -344,20 +140,7 @@
           </w:tcPr>
           <w:p>
             <w:r>
-              <w:t>pgvector and embeddings</w:t>
-            </w:r>
-          </w:p>
-        </w:tc>
-        <w:tc>
-          <w:tcPr>
-            <w:tcW w:type="dxa" w:w="0"/>
-          </w:tcPr>
-          <w:p>
-            <w:r>
-              <w:rPr>
-                <w:rFonts w:ascii="Mono" w:hAnsi="Mono"/>
-              </w:rPr>
-              <w:t>README-VECTOR-SEARCH.md</w:t>
+              <w:t>Short local/deploy bootstrap</w:t>
             </w:r>
           </w:p>
         </w:tc>
@@ -369,7 +152,7 @@
           </w:tcPr>
           <w:p>
             <w:r>
-              <w:t>Voice API</w:t>
+              <w:t>NETLIFY-SUPABASE-DEPLOYMENT.md ./NETLIFY-SUPABASE-DEPLOYMENT.md</w:t>
             </w:r>
           </w:p>
         </w:tc>
@@ -379,20 +162,7 @@
           </w:tcPr>
           <w:p>
             <w:r>
-              <w:t>Voice features</w:t>
-            </w:r>
-          </w:p>
-        </w:tc>
-        <w:tc>
-          <w:tcPr>
-            <w:tcW w:type="dxa" w:w="0"/>
-          </w:tcPr>
-          <w:p>
-            <w:r>
-              <w:rPr>
-                <w:rFonts w:ascii="Mono" w:hAnsi="Mono"/>
-              </w:rPr>
-              <w:t>README-VOICE-API.md</w:t>
+              <w:t>Hosted deployment, env vars, redirects, Supabase Auth</w:t>
             </w:r>
           </w:p>
         </w:tc>
@@ -404,7 +174,7 @@
           </w:tcPr>
           <w:p>
             <w:r>
-              <w:t>Management</w:t>
+              <w:t>SETUP-WITH-SCREENSHOTS.md ./SETUP-WITH-SCREENSHOTS.md</w:t>
             </w:r>
           </w:p>
         </w:tc>
@@ -414,20 +184,7 @@
           </w:tcPr>
           <w:p>
             <w:r>
-              <w:t>Rollout plan and KPIs</w:t>
-            </w:r>
-          </w:p>
-        </w:tc>
-        <w:tc>
-          <w:tcPr>
-            <w:tcW w:type="dxa" w:w="0"/>
-          </w:tcPr>
-          <w:p>
-            <w:r>
-              <w:rPr>
-                <w:rFonts w:ascii="Mono" w:hAnsi="Mono"/>
-              </w:rPr>
-              <w:t>MANAGEMENT-PLAYBOOK.md</w:t>
+              <w:t>Full setup guide and screenshots</w:t>
             </w:r>
           </w:p>
         </w:tc>
@@ -439,7 +196,7 @@
           </w:tcPr>
           <w:p>
             <w:r>
-              <w:t>Training</w:t>
+              <w:t>DATA-MAINTENANCE.md ./DATA-MAINTENANCE.md</w:t>
             </w:r>
           </w:p>
         </w:tc>
@@ -449,20 +206,7 @@
           </w:tcPr>
           <w:p>
             <w:r>
-              <w:t>Modules and labs</w:t>
-            </w:r>
-          </w:p>
-        </w:tc>
-        <w:tc>
-          <w:tcPr>
-            <w:tcW w:type="dxa" w:w="0"/>
-          </w:tcPr>
-          <w:p>
-            <w:r>
-              <w:rPr>
-                <w:rFonts w:ascii="Mono" w:hAnsi="Mono"/>
-              </w:rPr>
-              <w:t>training-suite/README.md</w:t>
+              <w:t>Admin backup, restore, and clear-test-data workflow</w:t>
             </w:r>
           </w:p>
         </w:tc>
@@ -474,7 +218,7 @@
           </w:tcPr>
           <w:p>
             <w:r>
-              <w:t>Support</w:t>
+              <w:t>SUPPORT.md ./SUPPORT.md</w:t>
             </w:r>
           </w:p>
         </w:tc>
@@ -484,20 +228,7 @@
           </w:tcPr>
           <w:p>
             <w:r>
-              <w:t>Triage and operations</w:t>
-            </w:r>
-          </w:p>
-        </w:tc>
-        <w:tc>
-          <w:tcPr>
-            <w:tcW w:type="dxa" w:w="0"/>
-          </w:tcPr>
-          <w:p>
-            <w:r>
-              <w:rPr>
-                <w:rFonts w:ascii="Mono" w:hAnsi="Mono"/>
-              </w:rPr>
-              <w:t>SUPPORT.md</w:t>
+              <w:t>Production support and escalation</w:t>
             </w:r>
           </w:p>
         </w:tc>
@@ -509,7 +240,7 @@
           </w:tcPr>
           <w:p>
             <w:r>
-              <w:t>Reference sources</w:t>
+              <w:t>PROJECT-TEST-RESULTS-2026-04-28.md ./PROJECT-TEST-RESULTS-2026-04-28.md</w:t>
             </w:r>
           </w:p>
         </w:tc>
@@ -519,7 +250,19 @@
           </w:tcPr>
           <w:p>
             <w:r>
-              <w:t>Style inspirations</w:t>
+              <w:t>Latest test and deploy evidence</w:t>
+            </w:r>
+          </w:p>
+        </w:tc>
+      </w:tr>
+      <w:tr>
+        <w:tc>
+          <w:tcPr>
+            <w:tcW w:type="dxa" w:w="0"/>
+          </w:tcPr>
+          <w:p>
+            <w:r>
+              <w:t>DOCUMENTATION-REFRESH-2026-04-28.md ./DOCUMENTATION-REFRESH-2026-04-28.md</w:t>
             </w:r>
           </w:p>
         </w:tc>
@@ -529,10 +272,7 @@
           </w:tcPr>
           <w:p>
             <w:r>
-              <w:rPr>
-                <w:rFonts w:ascii="Mono" w:hAnsi="Mono"/>
-              </w:rPr>
-              <w:t>REFERENCE-SOURCES.md</w:t>
+              <w:t>Documentation refresh scope, screenshot inventory, and validation</w:t>
             </w:r>
           </w:p>
         </w:tc>
@@ -635,6 +375,202 @@
     </w:p>
     <w:p>
       <w:r>
+        <w:t xml:space="preserve"> Training</w:t>
+      </w:r>
+    </w:p>
+    <w:p>
+      <w:pPr>
+        <w:pStyle w:val="Heading2"/>
+      </w:pPr>
+    </w:p>
+    <w:tbl>
+      <w:tblPr>
+        <w:tblW w:type="auto" w:w="0"/>
+        <w:tblLook w:firstColumn="1" w:firstRow="1" w:lastColumn="0" w:lastRow="0" w:noHBand="0" w:noVBand="1" w:val="04A0"/>
+      </w:tblPr>
+      <w:tblGrid>
+        <w:gridCol w:w="4320"/>
+        <w:gridCol w:w="4320"/>
+      </w:tblGrid>
+      <w:tr>
+        <w:tc>
+          <w:tcPr>
+            <w:tcW w:type="dxa" w:w="0"/>
+          </w:tcPr>
+          <w:p>
+            <w:r>
+              <w:t>Document</w:t>
+            </w:r>
+          </w:p>
+        </w:tc>
+        <w:tc>
+          <w:tcPr>
+            <w:tcW w:type="dxa" w:w="0"/>
+          </w:tcPr>
+          <w:p>
+            <w:r>
+              <w:t>Purpose</w:t>
+            </w:r>
+          </w:p>
+        </w:tc>
+      </w:tr>
+      <w:tr>
+        <w:tc>
+          <w:tcPr>
+            <w:tcW w:type="dxa" w:w="0"/>
+          </w:tcPr>
+          <w:p>
+            <w:r>
+              <w:t>training-suite/README.md ./training-suite/README.md</w:t>
+            </w:r>
+          </w:p>
+        </w:tc>
+        <w:tc>
+          <w:tcPr>
+            <w:tcW w:type="dxa" w:w="0"/>
+          </w:tcPr>
+          <w:p>
+            <w:r>
+              <w:t>Training suite overview</w:t>
+            </w:r>
+          </w:p>
+        </w:tc>
+      </w:tr>
+      <w:tr>
+        <w:tc>
+          <w:tcPr>
+            <w:tcW w:type="dxa" w:w="0"/>
+          </w:tcPr>
+          <w:p>
+            <w:r>
+              <w:t>training-suite/TRAINING-GUIDE.md ./training-suite/TRAINING-GUIDE.md</w:t>
+            </w:r>
+          </w:p>
+        </w:tc>
+        <w:tc>
+          <w:tcPr>
+            <w:tcW w:type="dxa" w:w="0"/>
+          </w:tcPr>
+          <w:p>
+            <w:r>
+              <w:t>End-to-end guided curriculum</w:t>
+            </w:r>
+          </w:p>
+        </w:tc>
+      </w:tr>
+      <w:tr>
+        <w:tc>
+          <w:tcPr>
+            <w:tcW w:type="dxa" w:w="0"/>
+          </w:tcPr>
+          <w:p>
+            <w:r>
+              <w:t>training-suite/modules/module-01-foundations.md ./training-suite/modules/module-01-foundations.md</w:t>
+            </w:r>
+          </w:p>
+        </w:tc>
+        <w:tc>
+          <w:tcPr>
+            <w:tcW w:type="dxa" w:w="0"/>
+          </w:tcPr>
+          <w:p>
+            <w:r>
+              <w:t>Platform foundations</w:t>
+            </w:r>
+          </w:p>
+        </w:tc>
+      </w:tr>
+      <w:tr>
+        <w:tc>
+          <w:tcPr>
+            <w:tcW w:type="dxa" w:w="0"/>
+          </w:tcPr>
+          <w:p>
+            <w:r>
+              <w:t>training-suite/modules/module-02-lifecycle.md ./training-suite/modules/module-02-lifecycle.md</w:t>
+            </w:r>
+          </w:p>
+        </w:tc>
+        <w:tc>
+          <w:tcPr>
+            <w:tcW w:type="dxa" w:w="0"/>
+          </w:tcPr>
+          <w:p>
+            <w:r>
+              <w:t>Script lifecycle</w:t>
+            </w:r>
+          </w:p>
+        </w:tc>
+      </w:tr>
+      <w:tr>
+        <w:tc>
+          <w:tcPr>
+            <w:tcW w:type="dxa" w:w="0"/>
+          </w:tcPr>
+          <w:p>
+            <w:r>
+              <w:t>training-suite/modules/module-03-analysis.md ./training-suite/modules/module-03-analysis.md</w:t>
+            </w:r>
+          </w:p>
+        </w:tc>
+        <w:tc>
+          <w:tcPr>
+            <w:tcW w:type="dxa" w:w="0"/>
+          </w:tcPr>
+          <w:p>
+            <w:r>
+              <w:t>AI analysis and PDF export</w:t>
+            </w:r>
+          </w:p>
+        </w:tc>
+      </w:tr>
+      <w:tr>
+        <w:tc>
+          <w:tcPr>
+            <w:tcW w:type="dxa" w:w="0"/>
+          </w:tcPr>
+          <w:p>
+            <w:r>
+              <w:t>training-suite/modules/module-04-search.md ./training-suite/modules/module-04-search.md</w:t>
+            </w:r>
+          </w:p>
+        </w:tc>
+        <w:tc>
+          <w:tcPr>
+            <w:tcW w:type="dxa" w:w="0"/>
+          </w:tcPr>
+          <w:p>
+            <w:r>
+              <w:t>Search and discovery</w:t>
+            </w:r>
+          </w:p>
+        </w:tc>
+      </w:tr>
+      <w:tr>
+        <w:tc>
+          <w:tcPr>
+            <w:tcW w:type="dxa" w:w="0"/>
+          </w:tcPr>
+          <w:p>
+            <w:r>
+              <w:t>training-suite/modules/module-05-operations.md ./training-suite/modules/module-05-operations.md</w:t>
+            </w:r>
+          </w:p>
+        </w:tc>
+        <w:tc>
+          <w:tcPr>
+            <w:tcW w:type="dxa" w:w="0"/>
+          </w:tcPr>
+          <w:p>
+            <w:r>
+              <w:t>Operations and governance</w:t>
+            </w:r>
+          </w:p>
+        </w:tc>
+      </w:tr>
+    </w:tbl>
+    <w:p>
+      <w:r>
         <w:t xml:space="preserve"> </w:t>
       </w:r>
     </w:p>
@@ -670,7 +606,589 @@
     </w:p>
     <w:p>
       <w:r>
-        <w:t xml:space="preserve"> Exported formats</w:t>
+        <w:t xml:space="preserve"> </w:t>
+      </w:r>
+    </w:p>
+    <w:p>
+      <w:r>
+        <w:t xml:space="preserve"> </w:t>
+      </w:r>
+    </w:p>
+    <w:p>
+      <w:r>
+        <w:t xml:space="preserve"> </w:t>
+      </w:r>
+    </w:p>
+    <w:p>
+      <w:r>
+        <w:t xml:space="preserve"> </w:t>
+      </w:r>
+    </w:p>
+    <w:p>
+      <w:r>
+        <w:t xml:space="preserve"> </w:t>
+      </w:r>
+    </w:p>
+    <w:p>
+      <w:r>
+        <w:t xml:space="preserve"> </w:t>
+      </w:r>
+    </w:p>
+    <w:p>
+      <w:r>
+        <w:t xml:space="preserve"> </w:t>
+      </w:r>
+    </w:p>
+    <w:p>
+      <w:r>
+        <w:t xml:space="preserve"> </w:t>
+      </w:r>
+    </w:p>
+    <w:p>
+      <w:r>
+        <w:t xml:space="preserve"> Reviews And Plans</w:t>
+      </w:r>
+    </w:p>
+    <w:p>
+      <w:pPr>
+        <w:pStyle w:val="Heading2"/>
+      </w:pPr>
+    </w:p>
+    <w:tbl>
+      <w:tblPr>
+        <w:tblW w:type="auto" w:w="0"/>
+        <w:tblLook w:firstColumn="1" w:firstRow="1" w:lastColumn="0" w:lastRow="0" w:noHBand="0" w:noVBand="1" w:val="04A0"/>
+      </w:tblPr>
+      <w:tblGrid>
+        <w:gridCol w:w="4320"/>
+        <w:gridCol w:w="4320"/>
+      </w:tblGrid>
+      <w:tr>
+        <w:tc>
+          <w:tcPr>
+            <w:tcW w:type="dxa" w:w="0"/>
+          </w:tcPr>
+          <w:p>
+            <w:r>
+              <w:t>Document</w:t>
+            </w:r>
+          </w:p>
+        </w:tc>
+        <w:tc>
+          <w:tcPr>
+            <w:tcW w:type="dxa" w:w="0"/>
+          </w:tcPr>
+          <w:p>
+            <w:r>
+              <w:t>Purpose</w:t>
+            </w:r>
+          </w:p>
+        </w:tc>
+      </w:tr>
+      <w:tr>
+        <w:tc>
+          <w:tcPr>
+            <w:tcW w:type="dxa" w:w="0"/>
+          </w:tcPr>
+          <w:p>
+            <w:r>
+              <w:t>CODEBASE-REVIEW-2026-04-28.md ./CODEBASE-REVIEW-2026-04-28.md</w:t>
+            </w:r>
+          </w:p>
+        </w:tc>
+        <w:tc>
+          <w:tcPr>
+            <w:tcW w:type="dxa" w:w="0"/>
+          </w:tcPr>
+          <w:p>
+            <w:r>
+              <w:t>Codebase review findings and risks</w:t>
+            </w:r>
+          </w:p>
+        </w:tc>
+      </w:tr>
+      <w:tr>
+        <w:tc>
+          <w:tcPr>
+            <w:tcW w:type="dxa" w:w="0"/>
+          </w:tcPr>
+          <w:p>
+            <w:r>
+              <w:t>REPAIR-EXECUTION-PLAN-2026-04-28.md ./REPAIR-EXECUTION-PLAN-2026-04-28.md</w:t>
+            </w:r>
+          </w:p>
+        </w:tc>
+        <w:tc>
+          <w:tcPr>
+            <w:tcW w:type="dxa" w:w="0"/>
+          </w:tcPr>
+          <w:p>
+            <w:r>
+              <w:t>Repair plan and strategy</w:t>
+            </w:r>
+          </w:p>
+        </w:tc>
+      </w:tr>
+      <w:tr>
+        <w:tc>
+          <w:tcPr>
+            <w:tcW w:type="dxa" w:w="0"/>
+          </w:tcPr>
+          <w:p>
+            <w:r>
+              <w:t>REPAIR-TEST-RESULTS-2026-04-28.md ./REPAIR-TEST-RESULTS-2026-04-28.md</w:t>
+            </w:r>
+          </w:p>
+        </w:tc>
+        <w:tc>
+          <w:tcPr>
+            <w:tcW w:type="dxa" w:w="0"/>
+          </w:tcPr>
+          <w:p>
+            <w:r>
+              <w:t>Post-repair validation results</w:t>
+            </w:r>
+          </w:p>
+        </w:tc>
+      </w:tr>
+      <w:tr>
+        <w:tc>
+          <w:tcPr>
+            <w:tcW w:type="dxa" w:w="0"/>
+          </w:tcPr>
+          <w:p>
+            <w:r>
+              <w:t>AI-ANALYSIS-CRITERIA-2026-04-26.md ./AI-ANALYSIS-CRITERIA-2026-04-26.md</w:t>
+            </w:r>
+          </w:p>
+        </w:tc>
+        <w:tc>
+          <w:tcPr>
+            <w:tcW w:type="dxa" w:w="0"/>
+          </w:tcPr>
+          <w:p>
+            <w:r>
+              <w:t>Current AI analysis criteria</w:t>
+            </w:r>
+          </w:p>
+        </w:tc>
+      </w:tr>
+      <w:tr>
+        <w:tc>
+          <w:tcPr>
+            <w:tcW w:type="dxa" w:w="0"/>
+          </w:tcPr>
+          <w:p>
+            <w:r>
+              <w:t>PROJECT-PERFORMANCE-TEST-DESIGN-2026-04-27.md ./PROJECT-PERFORMANCE-TEST-DESIGN-2026-04-27.md</w:t>
+            </w:r>
+          </w:p>
+        </w:tc>
+        <w:tc>
+          <w:tcPr>
+            <w:tcW w:type="dxa" w:w="0"/>
+          </w:tcPr>
+          <w:p>
+            <w:r>
+              <w:t>Performance test design</w:t>
+            </w:r>
+          </w:p>
+        </w:tc>
+      </w:tr>
+    </w:tbl>
+    <w:p>
+      <w:r>
+        <w:t xml:space="preserve"> </w:t>
+      </w:r>
+    </w:p>
+    <w:p>
+      <w:r>
+        <w:t xml:space="preserve"> </w:t>
+      </w:r>
+    </w:p>
+    <w:p>
+      <w:r>
+        <w:t xml:space="preserve"> </w:t>
+      </w:r>
+    </w:p>
+    <w:p>
+      <w:r>
+        <w:t xml:space="preserve"> </w:t>
+      </w:r>
+    </w:p>
+    <w:p>
+      <w:r>
+        <w:t xml:space="preserve"> </w:t>
+      </w:r>
+    </w:p>
+    <w:p>
+      <w:r>
+        <w:t xml:space="preserve"> </w:t>
+      </w:r>
+    </w:p>
+    <w:p>
+      <w:r>
+        <w:t xml:space="preserve"> </w:t>
+      </w:r>
+    </w:p>
+    <w:p>
+      <w:r>
+        <w:t xml:space="preserve"> </w:t>
+      </w:r>
+    </w:p>
+    <w:p>
+      <w:r>
+        <w:t xml:space="preserve"> </w:t>
+      </w:r>
+    </w:p>
+    <w:p>
+      <w:r>
+        <w:t xml:space="preserve"> </w:t>
+      </w:r>
+    </w:p>
+    <w:p>
+      <w:r>
+        <w:t xml:space="preserve"> </w:t>
+      </w:r>
+    </w:p>
+    <w:p>
+      <w:r>
+        <w:t xml:space="preserve"> Operational References</w:t>
+      </w:r>
+    </w:p>
+    <w:p>
+      <w:pPr>
+        <w:pStyle w:val="Heading2"/>
+      </w:pPr>
+    </w:p>
+    <w:tbl>
+      <w:tblPr>
+        <w:tblW w:type="auto" w:w="0"/>
+        <w:tblLook w:firstColumn="1" w:firstRow="1" w:lastColumn="0" w:lastRow="0" w:noHBand="0" w:noVBand="1" w:val="04A0"/>
+      </w:tblPr>
+      <w:tblGrid>
+        <w:gridCol w:w="4320"/>
+        <w:gridCol w:w="4320"/>
+      </w:tblGrid>
+      <w:tr>
+        <w:tc>
+          <w:tcPr>
+            <w:tcW w:type="dxa" w:w="0"/>
+          </w:tcPr>
+          <w:p>
+            <w:r>
+              <w:t>Document</w:t>
+            </w:r>
+          </w:p>
+        </w:tc>
+        <w:tc>
+          <w:tcPr>
+            <w:tcW w:type="dxa" w:w="0"/>
+          </w:tcPr>
+          <w:p>
+            <w:r>
+              <w:t>Purpose</w:t>
+            </w:r>
+          </w:p>
+        </w:tc>
+      </w:tr>
+      <w:tr>
+        <w:tc>
+          <w:tcPr>
+            <w:tcW w:type="dxa" w:w="0"/>
+          </w:tcPr>
+          <w:p>
+            <w:r>
+              <w:t>AUTHENTICATION-IMPROVEMENTS.md ./AUTHENTICATION-IMPROVEMENTS.md</w:t>
+            </w:r>
+          </w:p>
+        </w:tc>
+        <w:tc>
+          <w:tcPr>
+            <w:tcW w:type="dxa" w:w="0"/>
+          </w:tcPr>
+          <w:p>
+            <w:r>
+              <w:t>Auth behavior and approval gate notes</w:t>
+            </w:r>
+          </w:p>
+        </w:tc>
+      </w:tr>
+      <w:tr>
+        <w:tc>
+          <w:tcPr>
+            <w:tcW w:type="dxa" w:w="0"/>
+          </w:tcPr>
+          <w:p>
+            <w:r>
+              <w:t>DATABASE_DOCUMENTATION.md ./DATABASE_DOCUMENTATION.md</w:t>
+            </w:r>
+          </w:p>
+        </w:tc>
+        <w:tc>
+          <w:tcPr>
+            <w:tcW w:type="dxa" w:w="0"/>
+          </w:tcPr>
+          <w:p>
+            <w:r>
+              <w:t>Schema reference; hosted Supabase is authoritative</w:t>
+            </w:r>
+          </w:p>
+        </w:tc>
+      </w:tr>
+      <w:tr>
+        <w:tc>
+          <w:tcPr>
+            <w:tcW w:type="dxa" w:w="0"/>
+          </w:tcPr>
+          <w:p>
+            <w:r>
+              <w:t>LOGIN-CREDENTIALS.md ./LOGIN-CREDENTIALS.md</w:t>
+            </w:r>
+          </w:p>
+        </w:tc>
+        <w:tc>
+          <w:tcPr>
+            <w:tcW w:type="dxa" w:w="0"/>
+          </w:tcPr>
+          <w:p>
+            <w:r>
+              <w:t>Local/demo credential guidance</w:t>
+            </w:r>
+          </w:p>
+        </w:tc>
+      </w:tr>
+      <w:tr>
+        <w:tc>
+          <w:tcPr>
+            <w:tcW w:type="dxa" w:w="0"/>
+          </w:tcPr>
+          <w:p>
+            <w:r>
+              <w:t>MANAGEMENT-PLAYBOOK.md ./MANAGEMENT-PLAYBOOK.md</w:t>
+            </w:r>
+          </w:p>
+        </w:tc>
+        <w:tc>
+          <w:tcPr>
+            <w:tcW w:type="dxa" w:w="0"/>
+          </w:tcPr>
+          <w:p>
+            <w:r>
+              <w:t>Operator playbook</w:t>
+            </w:r>
+          </w:p>
+        </w:tc>
+      </w:tr>
+      <w:tr>
+        <w:tc>
+          <w:tcPr>
+            <w:tcW w:type="dxa" w:w="0"/>
+          </w:tcPr>
+          <w:p>
+            <w:r>
+              <w:t>REPOSITORY-ORGANIZATION.md ./REPOSITORY-ORGANIZATION.md</w:t>
+            </w:r>
+          </w:p>
+        </w:tc>
+        <w:tc>
+          <w:tcPr>
+            <w:tcW w:type="dxa" w:w="0"/>
+          </w:tcPr>
+          <w:p>
+            <w:r>
+              <w:t>Repo layout and cleanup notes</w:t>
+            </w:r>
+          </w:p>
+        </w:tc>
+      </w:tr>
+      <w:tr>
+        <w:tc>
+          <w:tcPr>
+            <w:tcW w:type="dxa" w:w="0"/>
+          </w:tcPr>
+          <w:p>
+            <w:r>
+              <w:t>SECURITY_INCIDENT_RESPONSE.md ./SECURITY_INCIDENT_RESPONSE.md</w:t>
+            </w:r>
+          </w:p>
+        </w:tc>
+        <w:tc>
+          <w:tcPr>
+            <w:tcW w:type="dxa" w:w="0"/>
+          </w:tcPr>
+          <w:p>
+            <w:r>
+              <w:t>Security response process</w:t>
+            </w:r>
+          </w:p>
+        </w:tc>
+      </w:tr>
+      <w:tr>
+        <w:tc>
+          <w:tcPr>
+            <w:tcW w:type="dxa" w:w="0"/>
+          </w:tcPr>
+          <w:p>
+            <w:r>
+              <w:t>UPDATES.md ./UPDATES.md</w:t>
+            </w:r>
+          </w:p>
+        </w:tc>
+        <w:tc>
+          <w:tcPr>
+            <w:tcW w:type="dxa" w:w="0"/>
+          </w:tcPr>
+          <w:p>
+            <w:r>
+              <w:t>Engineering change log</w:t>
+            </w:r>
+          </w:p>
+        </w:tc>
+      </w:tr>
+      <w:tr>
+        <w:tc>
+          <w:tcPr>
+            <w:tcW w:type="dxa" w:w="0"/>
+          </w:tcPr>
+          <w:p>
+            <w:r>
+              <w:t>UPLOAD-WORKFLOW.md ./UPLOAD-WORKFLOW.md</w:t>
+            </w:r>
+          </w:p>
+        </w:tc>
+        <w:tc>
+          <w:tcPr>
+            <w:tcW w:type="dxa" w:w="0"/>
+          </w:tcPr>
+          <w:p>
+            <w:r>
+              <w:t>Upload behavior and data model notes</w:t>
+            </w:r>
+          </w:p>
+        </w:tc>
+      </w:tr>
+      <w:tr>
+        <w:tc>
+          <w:tcPr>
+            <w:tcW w:type="dxa" w:w="0"/>
+          </w:tcPr>
+          <w:p>
+            <w:r>
+              <w:t>VOICE-TESTS-1-8-LATEST.md ./VOICE-TESTS-1-8-LATEST.md</w:t>
+            </w:r>
+          </w:p>
+        </w:tc>
+        <w:tc>
+          <w:tcPr>
+            <w:tcW w:type="dxa" w:w="0"/>
+          </w:tcPr>
+          <w:p>
+            <w:r>
+              <w:t>Latest voice test artifact</w:t>
+            </w:r>
+          </w:p>
+        </w:tc>
+      </w:tr>
+    </w:tbl>
+    <w:p>
+      <w:r>
+        <w:t xml:space="preserve"> </w:t>
+      </w:r>
+    </w:p>
+    <w:p>
+      <w:r>
+        <w:t xml:space="preserve"> </w:t>
+      </w:r>
+    </w:p>
+    <w:p>
+      <w:r>
+        <w:t xml:space="preserve"> </w:t>
+      </w:r>
+    </w:p>
+    <w:p>
+      <w:r>
+        <w:t xml:space="preserve"> </w:t>
+      </w:r>
+    </w:p>
+    <w:p>
+      <w:r>
+        <w:t xml:space="preserve"> </w:t>
+      </w:r>
+    </w:p>
+    <w:p>
+      <w:r>
+        <w:t xml:space="preserve"> </w:t>
+      </w:r>
+    </w:p>
+    <w:p>
+      <w:r>
+        <w:t xml:space="preserve"> </w:t>
+      </w:r>
+    </w:p>
+    <w:p>
+      <w:r>
+        <w:t xml:space="preserve"> </w:t>
+      </w:r>
+    </w:p>
+    <w:p>
+      <w:r>
+        <w:t xml:space="preserve"> </w:t>
+      </w:r>
+    </w:p>
+    <w:p>
+      <w:r>
+        <w:t xml:space="preserve"> </w:t>
+      </w:r>
+    </w:p>
+    <w:p>
+      <w:r>
+        <w:t xml:space="preserve"> </w:t>
+      </w:r>
+    </w:p>
+    <w:p>
+      <w:r>
+        <w:t xml:space="preserve"> </w:t>
+      </w:r>
+    </w:p>
+    <w:p>
+      <w:r>
+        <w:t xml:space="preserve"> </w:t>
+      </w:r>
+    </w:p>
+    <w:p>
+      <w:r>
+        <w:t xml:space="preserve"> </w:t>
+      </w:r>
+    </w:p>
+    <w:p>
+      <w:r>
+        <w:t xml:space="preserve"> </w:t>
+      </w:r>
+    </w:p>
+    <w:p>
+      <w:r>
+        <w:t xml:space="preserve"> </w:t>
+      </w:r>
+    </w:p>
+    <w:p>
+      <w:r>
+        <w:t xml:space="preserve"> </w:t>
+      </w:r>
+    </w:p>
+    <w:p>
+      <w:r>
+        <w:t xml:space="preserve"> </w:t>
+      </w:r>
+    </w:p>
+    <w:p>
+      <w:r>
+        <w:t xml:space="preserve"> </w:t>
+      </w:r>
+    </w:p>
+    <w:p>
+      <w:r>
+        <w:t xml:space="preserve"> Screenshot Sets</w:t>
       </w:r>
     </w:p>
     <w:p>
@@ -679,31 +1197,47 @@
       </w:pPr>
     </w:p>
     <w:p>
+      <w:pPr>
+        <w:pStyle w:val="ListBullet"/>
+      </w:pPr>
       <w:r>
-        <w:t xml:space="preserve">Run </w:t>
+        <w:t xml:space="preserve">Current dated captures: </w:t>
       </w:r>
       <w:r>
         <w:rPr>
           <w:rFonts w:ascii="Mono" w:hAnsi="Mono"/>
         </w:rPr>
-        <w:t>scripts/export-docs.sh --all</w:t>
+        <w:t>docs/screenshots/current-2026-04-29/</w:t>
       </w:r>
+    </w:p>
+    <w:p>
+      <w:pPr>
+        <w:pStyle w:val="ListBullet"/>
+      </w:pPr>
       <w:r>
-        <w:t xml:space="preserve"> to generate HTML, PDF, and DOCX exports in </w:t>
+        <w:t xml:space="preserve">README framed captures: </w:t>
       </w:r>
       <w:r>
         <w:rPr>
           <w:rFonts w:ascii="Mono" w:hAnsi="Mono"/>
         </w:rPr>
-        <w:t>docs/exports/</w:t>
-      </w:r>
-      <w:r>
-        <w:t>.</w:t>
+        <w:t>docs/screenshots/readme/</w:t>
       </w:r>
     </w:p>
     <w:p>
+      <w:pPr>
+        <w:pStyle w:val="ListBullet"/>
+      </w:pPr>
       <w:r>
-        <w:t>With the backend running, exports are available at http://localhost:4000/docs/exports/.</w:t>
+        <w:t>New April 29 feature captures: script editor VS Code export, analysis runtime requirements, and Settings -&gt; Appearance.</w:t>
+      </w:r>
+    </w:p>
+    <w:p>
+      <w:pPr>
+        <w:pStyle w:val="ListBullet"/>
+      </w:pPr>
+      <w:r>
+        <w:t>Older screenshot files are preserved for history unless a current doc links to them.</w:t>
       </w:r>
     </w:p>
     <w:p>
@@ -711,48 +1245,55 @@
         <w:pStyle w:val="Heading2"/>
       </w:pPr>
       <w:r>
-        <w:t>UI snapshot</w:t>
+        <w:t>Archives</w:t>
       </w:r>
     </w:p>
     <w:p>
       <w:r>
-        <w:drawing>
-          <wp:inline xmlns:a="http://schemas.openxmlformats.org/drawingml/2006/main" xmlns:pic="http://schemas.openxmlformats.org/drawingml/2006/picture">
-            <wp:extent cx="5303520" cy="5303520"/>
-            <wp:docPr id="3" name="Picture 3"/>
-            <wp:cNvGraphicFramePr>
-              <a:graphicFrameLocks noChangeAspect="1"/>
-            </wp:cNvGraphicFramePr>
-            <a:graphic>
-              <a:graphicData uri="http://schemas.openxmlformats.org/drawingml/2006/picture">
-                <pic:pic>
-                  <pic:nvPicPr>
-                    <pic:cNvPr id="0" name="image.png"/>
-                    <pic:cNvPicPr/>
-                  </pic:nvPicPr>
-                  <pic:blipFill>
-                    <a:blip r:embed="rId9"/>
-                    <a:stretch>
-                      <a:fillRect/>
-                    </a:stretch>
-                  </pic:blipFill>
-                  <pic:spPr>
-                    <a:xfrm>
-                      <a:off x="0" y="0"/>
-                      <a:ext cx="5303520" cy="5303520"/>
-                    </a:xfrm>
-                    <a:prstGeom prst="rect"/>
-                  </pic:spPr>
-                </pic:pic>
-              </a:graphicData>
-            </a:graphic>
-          </wp:inline>
-        </w:drawing>
+        <w:t>Previous-run and superseded reports live under:</w:t>
+      </w:r>
+    </w:p>
+    <w:p>
+      <w:pPr>
+        <w:pStyle w:val="ListBullet"/>
+      </w:pPr>
+      <w:r>
+        <w:rPr>
+          <w:rFonts w:ascii="Mono" w:hAnsi="Mono"/>
+        </w:rPr>
+        <w:t>docs/archive/previous-run-reports-2026-04-28/</w:t>
+      </w:r>
+    </w:p>
+    <w:p>
+      <w:pPr>
+        <w:pStyle w:val="ListBullet"/>
+      </w:pPr>
+      <w:r>
+        <w:rPr>
+          <w:rFonts w:ascii="Mono" w:hAnsi="Mono"/>
+        </w:rPr>
+        <w:t>docs/archive/superseded-reports-2026-04-28/</w:t>
+      </w:r>
+    </w:p>
+    <w:p>
+      <w:pPr>
+        <w:pStyle w:val="ListBullet"/>
+      </w:pPr>
+      <w:r>
+        <w:rPr>
+          <w:rFonts w:ascii="Mono" w:hAnsi="Mono"/>
+        </w:rPr>
+        <w:t>archive/unused-files-2026-04-26/</w:t>
       </w:r>
     </w:p>
     <w:p>
       <w:r>
-        <w:t>Generated 2026-01-16 23:34 UTC</w:t>
+        <w:t>Do not delete these files. Move newly retired docs into an archive folder with a date.</w:t>
+      </w:r>
+    </w:p>
+    <w:p>
+      <w:r>
+        <w:t>Generated 2026-04-29 14:08 UTC</w:t>
         <w:t xml:space="preserve"> </w:t>
       </w:r>
     </w:p>

</xml_diff>